<commit_message>
Update AAIP NSF 26-509 Project Description draft.
Manual revision to the Project Description only; no other local changes included.

Co-authored-by: Cursor <cursoragent@cursor.com>
</commit_message>
<xml_diff>
--- a/AAIP/26-509/Drafts/Project Description.docx
+++ b/AAIP/26-509/Drafts/Project Description.docx
@@ -1194,59 +1194,64 @@
     </w:p>
     <w:p>
       <w:r>
-        <w:t>The IDC budget will be organized around the project’s operational work areas and award phases. The proposed budget will support personnel, fringe benefits, travel, equipment if needed, participant support where appropriate, software and cloud services, consultant services, subawards, user support, training, evaluation, dissemination, and indirect costs. The budget will be developed to support a three-year Category II transition project with sufficient resources to achieve full operations by the end of Year 1 and national scale-up during Years 2 and 3.</w:t>
-      </w:r>
-    </w:p>
-    <w:p>
-      <w:r>
-        <w:t>The largest budget category will be personnel because the IDC is an operational cyberinfrastructure service requiring sustained leadership, data engineering, system administration, analytics, governance, user support, training, evaluation, and project management. AAIP personnel will support project leadership, award administration, governance coordination, community engagement, partner onboarding, communications, and national convening. SGDI personnel will support data engineering, data science, AI service development, database architecture, user technical assistance, evaluation, reporting, and system operations. The budget will include sufficient effort for senior personnel and professional staff to maintain accountability, continuity, and responsiveness throughout the award period.</w:t>
-      </w:r>
-    </w:p>
-    <w:p>
-      <w:r>
-        <w:t xml:space="preserve">The budget will include cloud infrastructure and computing services needed to operate </w:t>
+        <w:t>The proposed budget is structured to support a three-year Category II transition from existing Tribal-serving data integration, analytics, reporting, governance, and technical assistance capabilities into a national-scale operational data infrastructure. The total request is estimated at approximately $8.75 million over three years, within the NSF 26-509 Category II funding limit. The budget is organized to support Year 1 transition to operations, Year 2 national scale-up, and Year 3 mature operations, optimization, evaluation, and sustainability planning.</w:t>
+      </w:r>
+    </w:p>
+    <w:p>
+      <w:r>
+        <w:t>AAIP will serve as the lead organization, prime recipient, national operator, governance convener, and infrastructure contract holder for the Indigenous Data Commons. AAIP-managed costs are estimated at approximately $4.8 million over the project period, representing slightly more than half of the total project budget. These costs support lead-recipient administration, project leadership, fiscal management, procurement, subaward monitoring, governance coordination, partner engagement, advisory activities, training coordination, user community support, cloud and infrastructure service contracts, cybersecurity services, consultants, travel, and indirect costs. This allocation ensures that AAIP has the organizational and operational capacity to manage the IDC as a national cyberinfrastructure service rather than as a pass-through arrangement.</w:t>
+      </w:r>
+    </w:p>
+    <w:p>
+      <w:r>
+        <w:t>SGDI will serve as the Technical Operations Core through a subaward from AAIP. The SGDI subaward is estimated at approximately $3.95 million over the project period. SGDI costs support the technical personnel and implementation capacity required to build, configure, operate, document, evaluate, and improve the IDC. SGDI responsibilities include data engineering, data source inventory, connector configuration, data validation, data pipeline development, semantic data modeling, metadata documentation, dashboard development, AI-assisted reporting, API and Model Context Protocol-compatible access services, evaluation, technical documentation</w:t>
       </w:r>
       <w:proofErr w:type="gramStart"/>
       <w:r>
-        <w:t>the IDC</w:t>
+        <w:t>, help</w:t>
       </w:r>
       <w:proofErr w:type="gramEnd"/>
       <w:r>
-        <w:t>. These costs may include secure hosting, storage, compute, database services, monitoring, logging, backup, authentication, data transfer, development environments, and analytic workspaces. Costs will be estimated based on expected Year 1 early-access usage, Year 2 scale-up, and Year 3 mature operations. The budget will distinguish between infrastructure needed for IDC operations and costs that would constitute permanent long-term data storage or archival curation outside the scope of IDSS support.</w:t>
-      </w:r>
-    </w:p>
-    <w:p>
-      <w:r>
-        <w:t>The budget will include software, licensing, and service costs only where necessary to achieve operational reliability, security, usability, or interoperability. Open-source options will be used where appropriate. Commercial tools may be justified when they reduce operational risk, improve security, support national-scale user services, or provide capabilities that would be inefficient to build internally during the award period.</w:t>
-      </w:r>
-    </w:p>
-    <w:p>
-      <w:r>
-        <w:t>The budget will include travel for annual NSF PI meetings or major cyberinfrastructure conferences, as expected under the solicitation. Travel will also support partner engagement, training workshops, governance meetings, and outreach where necessary for national-scale onboarding and user support. Travel costs will be budgeted conservatively and tied directly to project objectives.</w:t>
-      </w:r>
-    </w:p>
-    <w:p>
+        <w:t xml:space="preserve"> desk support, user onboarding, and training support.</w:t>
+      </w:r>
+    </w:p>
+    <w:p>
+      <w:r>
+        <w:t>The largest cost category across the project is personnel, reflecting the operational nature of the proposed infrastructure. The IDC requires sustained leadership, project management, grants administration, data governance, data engineering, AI services, security coordination, analytics, documentation, training, evaluation, and user support. Personnel costs are distributed between AAIP and SGDI according to organizational responsibility: AAIP will staff the lead-recipient, governance, administration, engagement, and national operations functions, while SGDI will staff the technical implementation and operations functions.</w:t>
+      </w:r>
+    </w:p>
+    <w:p>
+      <w:r>
+        <w:t xml:space="preserve">The project will use a cloud-first infrastructure strategy. Major production infrastructure, cloud services, cybersecurity services, identity and access management, monitoring, logging, backup, database </w:t>
+      </w:r>
       <w:r>
         <w:lastRenderedPageBreak/>
-        <w:t>The budget may include participant support costs for training activities, workshops, or user engagement events if such costs are necessary and allowable. These costs will be clearly separated from personnel, consultant, and travel costs and will be used only for eligible participants rather than employees or project staff.</w:t>
-      </w:r>
-    </w:p>
-    <w:p>
-      <w:r>
-        <w:t xml:space="preserve">The budget will include evaluation and dissemination costs needed to document performance, user satisfaction, research impact, training outcomes, and lessons learned. Dissemination may include documentation, public reports, conference presentations, training materials, open-source software releases, and community-facing summaries. The project will not </w:t>
-      </w:r>
-      <w:proofErr w:type="gramStart"/>
-      <w:r>
-        <w:t>budget</w:t>
-      </w:r>
-      <w:proofErr w:type="gramEnd"/>
-      <w:r>
-        <w:t xml:space="preserve"> for individual research enabled by the infrastructure, building renovations, entertainment, alcohol, or other unallowable costs.</w:t>
-      </w:r>
-    </w:p>
-    <w:p>
-      <w:r>
-        <w:t>A detailed cost estimate will be provided as a required supplementary document. That estimate will organize costs by work area and project phase, including transition to operations in Year 1, national scale-up in Year 2, and mature operations and sustainability planning in Year 3. The cost estimate will describe the basis for major labor, infrastructure, software, travel, support, and outsourcing assumptions. It will also identify cost drivers, maintenance needs, and operational dependencies that affect total cost of ownership.</w:t>
+        <w:t>services, dashboard hosting, analytic workspaces, and related service contracts will be held by AAIP as the lead organization. SGDI will provide technical configuration, implementation, maintenance support, and operational guidance through its subaward. This approach supports rapid deployment, secure national access, scalability, cost monitoring, and operational reliability while avoiding a large on-premises server build unless later technical review identifies a specific need for limited special-purpose equipment.</w:t>
+      </w:r>
+    </w:p>
+    <w:p>
+      <w:r>
+        <w:t>Software, licensing, and managed service costs will be included only where necessary to support operational reliability, security, accessibility, interoperability, documentation, user support, or AI-enabled services. Open-source tools will be used where feasible. Commercial or managed services will be justified when they reduce operational risk, improve security, strengthen service availability, or provide capabilities that would be inefficient to build internally during the award period.</w:t>
+      </w:r>
+    </w:p>
+    <w:p>
+      <w:r>
+        <w:t>Travel costs will support required NSF participation, project coordination, partner onboarding, governance meetings, training activities, user engagement, technical implementation support, and dissemination of project outcomes. Participant support costs may be included for eligible participants in training, onboarding, user engagement, or community learning activities when allowable and necessary to broaden participation among Native-serving organizations, Tribal Colleges and Universities, Native students, data stewards, and early-career researchers.</w:t>
+      </w:r>
+    </w:p>
+    <w:p>
+      <w:r>
+        <w:t>The budget includes evaluation, documentation, and dissemination costs needed to measure project performance, document user outcomes, release reusable project products, and share lessons learned with the broader cyberinfrastructure, data science, and Native-serving research communities. Dissemination products may include user guides, implementation guides, training materials, governance templates, metadata templates, data dictionary templates, public reports, open-source software documentation, conference presentations, and community-facing summaries.</w:t>
+      </w:r>
+    </w:p>
+    <w:p>
+      <w:r>
+        <w:t>The project will not budget for individual research projects enabled by the infrastructure, building renovations, entertainment, alcohol, permanent long-term archival hosting of all partner research data, or other unallowable costs. Operational storage, compute, and data services included in the budget will be limited to what is necessary to deploy and operate the IDC during the award period. Long-term preservation of approved public products or datasets will be addressed through appropriate repositories, institutional archives, Tribal repositories, federal repositories, or other sustainable mechanisms consistent with governance requirements.</w:t>
+      </w:r>
+    </w:p>
+    <w:p>
+      <w:r>
+        <w:t>A detailed cost estimate is provided as a required supplementary document. That estimate organizes costs by organization, project year, work area, and award phase. It describes the basis for personnel, fringe benefits, indirect costs, cloud and computer services, software, consultants, travel, participant support, documentation, dissemination, and the SGDI subaward. The detailed estimate also identifies cost drivers, maintenance requirements, external service agreements, and total cost of ownership considerations for the IDC as a national-scale Indigenous-governed data infrastructure.</w:t>
       </w:r>
     </w:p>
     <w:p>
@@ -1266,7 +1271,11 @@
     </w:p>
     <w:p>
       <w:r>
-        <w:t>The IDC will strengthen national research capacity by creating a trusted data infrastructure for Native-serving organizations and the research communities that work with them. The project will expand access to advanced cyberinfrastructure for organizations that often operate without dedicated data engineering teams, secure analytic environments, or AI-ready data systems. By reducing the technical burden of data integration, documentation, governance, analysis, and reporting, the IDC will allow Tribal and Native-serving partners to use evidence more efficiently in support of community priorities.</w:t>
+        <w:t xml:space="preserve">The IDC will strengthen national research capacity by creating a trusted data infrastructure for Native-serving organizations and the research communities that work with them. The project will expand access </w:t>
+      </w:r>
+      <w:r>
+        <w:lastRenderedPageBreak/>
+        <w:t>to advanced cyberinfrastructure for organizations that often operate without dedicated data engineering teams, secure analytic environments, or AI-ready data systems. By reducing the technical burden of data integration, documentation, governance, analysis, and reporting, the IDC will allow Tribal and Native-serving partners to use evidence more efficiently in support of community priorities.</w:t>
       </w:r>
     </w:p>
     <w:p>
@@ -1281,11 +1290,7 @@
     </w:p>
     <w:p>
       <w:r>
-        <w:t xml:space="preserve">The IDC will provide broader societal benefit by improving the ability of Native-serving systems to generate reliable evidence for education, health, workforce, environmental, and community planning. Better data infrastructure can strengthen grant readiness, improve evaluation, support research partnerships, reduce duplicative reporting, and make public and organizational data more usable. The </w:t>
-      </w:r>
-      <w:r>
-        <w:lastRenderedPageBreak/>
-        <w:t>project will also demonstrate how open science can be advanced without treating all data as open by default. By operationalizing Indigenous data sovereignty, the IDC will contribute a model for responsible data sharing that balances scientific discovery with authority, care, accountability, and respect.</w:t>
+        <w:t>The IDC will provide broader societal benefit by improving the ability of Native-serving systems to generate reliable evidence for education, health, workforce, environmental, and community planning. Better data infrastructure can strengthen grant readiness, improve evaluation, support research partnerships, reduce duplicative reporting, and make public and organizational data more usable. The project will also demonstrate how open science can be advanced without treating all data as open by default. By operationalizing Indigenous data sovereignty, the IDC will contribute a model for responsible data sharing that balances scientific discovery with authority, care, accountability, and respect.</w:t>
       </w:r>
     </w:p>
     <w:p>
@@ -1318,7 +1323,6 @@
         <w:t>If any PI or co-PI has received qualifying NSF support, this section will identify the award number, amount, period of support, project title, intellectual merit outcomes, broader impacts outcomes, publications, research products, data or software availability, and relationship of the prior work to the proposed IDC project. The final version of this section will follow the PAPPG requirement that results from prior NSF support be included within the Project Description when applicable.</w:t>
       </w:r>
     </w:p>
-    <w:p/>
     <w:sectPr>
       <w:pgSz w:w="12240" w:h="15840"/>
       <w:pgMar w:top="720" w:right="720" w:bottom="720" w:left="720" w:header="720" w:footer="720" w:gutter="0"/>

</xml_diff>